<commit_message>
Correção: Gantt duplicado, Lista de Figuras, comentários e formatação
</commit_message>
<xml_diff>
--- a/TCC - AKIRA, HENRIQUE, WESLLEY_Entrega 2.docx
+++ b/TCC - AKIRA, HENRIQUE, WESLLEY_Entrega 2.docx
@@ -1618,33 +1618,8 @@
         <w:rPr>
           <w:rFonts w:ascii="Arial" w:hAnsi="Arial"/>
           <w:sz w:val="24"/>
-          <w:szCs w:val="24"/>
-        </w:rPr>
-        <w:t xml:space="preserve">Prof. </w:t>
-      </w:r>
-      <w:r>
-        <w:rPr>
-          <w:rFonts w:ascii="Arial" w:hAnsi="Arial"/>
-          <w:sz w:val="24"/>
-          <w:szCs w:val="24"/>
-        </w:rPr>
-        <w:t>&lt;&lt; Nome outro membro &gt;&gt;</w:t>
-      </w:r>
-      <w:r>
-        <w:rPr>
-          <w:rFonts w:ascii="Arial" w:hAnsi="Arial"/>
-          <w:sz w:val="24"/>
-          <w:szCs w:val="24"/>
-        </w:rPr>
-        <w:t xml:space="preserve"> – </w:t>
-      </w:r>
-      <w:r>
-        <w:rPr>
-          <w:rFonts w:ascii="Arial" w:hAnsi="Arial"/>
-          <w:sz w:val="24"/>
-          <w:szCs w:val="24"/>
-        </w:rPr>
-        <w:t>SENAC</w:t>
+        </w:rPr>
+        <w:t>Prof. – SENAC</w:t>
       </w:r>
     </w:p>
     <w:p>
@@ -1746,33 +1721,8 @@
         <w:rPr>
           <w:rFonts w:ascii="Arial" w:hAnsi="Arial"/>
           <w:sz w:val="24"/>
-          <w:szCs w:val="24"/>
-        </w:rPr>
-        <w:t xml:space="preserve">Prof. </w:t>
-      </w:r>
-      <w:r>
-        <w:rPr>
-          <w:rFonts w:ascii="Arial" w:hAnsi="Arial"/>
-          <w:sz w:val="24"/>
-          <w:szCs w:val="24"/>
-        </w:rPr>
-        <w:t>&lt;&lt; Nome membro externo&gt;&gt;</w:t>
-      </w:r>
-      <w:r>
-        <w:rPr>
-          <w:rFonts w:ascii="Arial" w:hAnsi="Arial"/>
-          <w:sz w:val="24"/>
-          <w:szCs w:val="24"/>
-        </w:rPr>
-        <w:t xml:space="preserve"> - </w:t>
-      </w:r>
-      <w:r>
-        <w:rPr>
-          <w:rFonts w:ascii="Arial" w:hAnsi="Arial"/>
-          <w:sz w:val="24"/>
-          <w:szCs w:val="24"/>
-        </w:rPr>
-        <w:t>&lt;&lt; Instituição Externa &gt;&gt;</w:t>
+        </w:rPr>
+        <w:t>Prof. -</w:t>
       </w:r>
     </w:p>
     <w:p>
@@ -2582,217 +2532,23 @@
           <w14:ligatures w14:val="standardContextual"/>
         </w:rPr>
       </w:pPr>
-      <w:hyperlink w:anchor="_Toc223286286" w:history="1">
-        <w:r>
-          <w:rPr>
-            <w:rStyle w:val="Hyperlink"/>
-            <w:rFonts w:eastAsia="Arial"/>
-            <w:b/>
-            <w:noProof/>
-          </w:rPr>
-          <w:t>Figura 1</w:t>
-        </w:r>
-        <w:r>
-          <w:rPr>
-            <w:rStyle w:val="Hyperlink"/>
-            <w:rFonts w:eastAsia="Arial"/>
-            <w:noProof/>
-          </w:rPr>
-          <w:t xml:space="preserve"> – Gráfico de Gantt do Cronograma do Projeto</w:t>
-        </w:r>
-        <w:r>
-          <w:rPr>
-            <w:noProof/>
-            <w:webHidden/>
-          </w:rPr>
-          <w:tab/>
-        </w:r>
-        <w:r>
-          <w:rPr>
-            <w:noProof/>
-            <w:webHidden/>
-          </w:rPr>
-          <w:fldChar w:fldCharType="begin"/>
-        </w:r>
-        <w:r>
-          <w:rPr>
-            <w:noProof/>
-            <w:webHidden/>
-          </w:rPr>
-          <w:instrText xml:space="preserve"> PAGEREF _Toc223286286 \h </w:instrText>
-        </w:r>
-        <w:r>
-          <w:rPr>
-            <w:noProof/>
-            <w:webHidden/>
-          </w:rPr>
-        </w:r>
-        <w:r>
-          <w:rPr>
-            <w:noProof/>
-            <w:webHidden/>
-          </w:rPr>
-          <w:fldChar w:fldCharType="separate"/>
-        </w:r>
-        <w:r>
-          <w:rPr>
-            <w:noProof/>
-            <w:webHidden/>
-          </w:rPr>
-          <w:t>15</w:t>
-        </w:r>
-        <w:r>
-          <w:rPr>
-            <w:noProof/>
-            <w:webHidden/>
-          </w:rPr>
-          <w:fldChar w:fldCharType="end"/>
-        </w:r>
-      </w:hyperlink>
-      <w:r>
-        <w:rPr>
-          <w:sz w:val="20"/>
+      <w:r>
+        <w:rPr>
+          <w:rFonts w:ascii="Arial" w:hAnsi="Arial"/>
+          <w:sz w:val="24"/>
         </w:rPr>
         <w:t>Figura 1 — Cronograma de atividades do projeto (Parte 1/2)</w:t>
       </w:r>
     </w:p>
     <w:p>
       <w:pPr>
-        <w:jc w:val="center"/>
-      </w:pPr>
-      <w:r>
-        <w:rPr>
-          <w:rFonts w:ascii="Arial" w:hAnsi="Arial"/>
-          <w:noProof/>
-          <w:sz w:val="24"/>
-        </w:rPr>
-        <w:drawing>
-          <wp:inline distT="0" distB="0" distL="0" distR="0" wp14:anchorId="16E421AD" wp14:editId="48EC9A2D">
-            <wp:extent cx="5400000" cy="4038342"/>
-            <wp:effectExtent l="0" t="0" r="0" b="0"/>
-            <wp:docPr id="2" name="Picture 2"/>
-            <wp:cNvGraphicFramePr>
-              <a:graphicFrameLocks xmlns:a="http://schemas.openxmlformats.org/drawingml/2006/main" noChangeAspect="1"/>
-            </wp:cNvGraphicFramePr>
-            <a:graphic xmlns:a="http://schemas.openxmlformats.org/drawingml/2006/main">
-              <a:graphicData uri="http://schemas.openxmlformats.org/drawingml/2006/picture">
-                <pic:pic xmlns:pic="http://schemas.openxmlformats.org/drawingml/2006/picture">
-                  <pic:nvPicPr>
-                    <pic:cNvPr id="0" name="Gantt_Pagina1.png"/>
-                    <pic:cNvPicPr/>
-                  </pic:nvPicPr>
-                  <pic:blipFill>
-                    <a:blip r:embed="rId8"/>
-                    <a:stretch>
-                      <a:fillRect/>
-                    </a:stretch>
-                  </pic:blipFill>
-                  <pic:spPr>
-                    <a:xfrm>
-                      <a:off x="0" y="0"/>
-                      <a:ext cx="5400000" cy="4038342"/>
-                    </a:xfrm>
-                    <a:prstGeom prst="rect">
-                      <a:avLst/>
-                    </a:prstGeom>
-                  </pic:spPr>
-                </pic:pic>
-              </a:graphicData>
-            </a:graphic>
-          </wp:inline>
-        </w:drawing>
-      </w:r>
-    </w:p>
-    <w:p>
-      <w:pPr>
-        <w:spacing w:line="360" w:lineRule="auto"/>
-        <w:jc w:val="both"/>
-      </w:pPr>
-      <w:r>
-        <w:rPr>
-          <w:rFonts w:ascii="Arial" w:hAnsi="Arial"/>
-          <w:i/>
-          <w:sz w:val="20"/>
-          <w:szCs w:val="20"/>
-        </w:rPr>
-        <w:t>Fonte: Elaborado pelos autores (2026).</w:t>
-      </w:r>
-    </w:p>
-    <w:p>
-      <w:pPr>
-        <w:spacing w:line="360" w:lineRule="auto"/>
-        <w:jc w:val="both"/>
-      </w:pPr>
-      <w:r>
-        <w:rPr>
-          <w:rFonts w:ascii="Arial" w:hAnsi="Arial"/>
-          <w:sz w:val="20"/>
-          <w:szCs w:val="20"/>
+        <w:pStyle w:val="table of figures"/>
+      </w:pPr>
+      <w:r>
+        <w:rPr>
+          <w:rFonts w:ascii="Arial" w:hAnsi="Arial"/>
         </w:rPr>
         <w:t>Figura 2 — Cronograma de atividades do projeto (Parte 2/2)</w:t>
-      </w:r>
-    </w:p>
-    <w:p>
-      <w:pPr>
-        <w:jc w:val="center"/>
-      </w:pPr>
-      <w:r>
-        <w:rPr>
-          <w:rFonts w:ascii="Arial" w:hAnsi="Arial"/>
-          <w:noProof/>
-          <w:sz w:val="24"/>
-        </w:rPr>
-        <w:drawing>
-          <wp:inline distT="0" distB="0" distL="0" distR="0" wp14:anchorId="37E39042" wp14:editId="3021FAA3">
-            <wp:extent cx="5400000" cy="2958734"/>
-            <wp:effectExtent l="0" t="0" r="0" b="0"/>
-            <wp:docPr id="3" name="Picture 3"/>
-            <wp:cNvGraphicFramePr>
-              <a:graphicFrameLocks xmlns:a="http://schemas.openxmlformats.org/drawingml/2006/main" noChangeAspect="1"/>
-            </wp:cNvGraphicFramePr>
-            <a:graphic xmlns:a="http://schemas.openxmlformats.org/drawingml/2006/main">
-              <a:graphicData uri="http://schemas.openxmlformats.org/drawingml/2006/picture">
-                <pic:pic xmlns:pic="http://schemas.openxmlformats.org/drawingml/2006/picture">
-                  <pic:nvPicPr>
-                    <pic:cNvPr id="0" name="Gantt_Pagina2.png"/>
-                    <pic:cNvPicPr/>
-                  </pic:nvPicPr>
-                  <pic:blipFill>
-                    <a:blip r:embed="rId9"/>
-                    <a:stretch>
-                      <a:fillRect/>
-                    </a:stretch>
-                  </pic:blipFill>
-                  <pic:spPr>
-                    <a:xfrm>
-                      <a:off x="0" y="0"/>
-                      <a:ext cx="5400000" cy="2958734"/>
-                    </a:xfrm>
-                    <a:prstGeom prst="rect">
-                      <a:avLst/>
-                    </a:prstGeom>
-                  </pic:spPr>
-                </pic:pic>
-              </a:graphicData>
-            </a:graphic>
-          </wp:inline>
-        </w:drawing>
-      </w:r>
-    </w:p>
-    <w:p>
-      <w:pPr>
-        <w:spacing w:line="360" w:lineRule="auto"/>
-        <w:jc w:val="both"/>
-      </w:pPr>
-      <w:r>
-        <w:rPr>
-          <w:rFonts w:ascii="Arial" w:hAnsi="Arial"/>
-          <w:i/>
-          <w:sz w:val="20"/>
-          <w:szCs w:val="20"/>
-        </w:rPr>
-        <w:lastRenderedPageBreak/>
-        <w:t>Fonte: Elaborado pelos autores (2026).</w:t>
       </w:r>
     </w:p>
     <w:p>
@@ -6917,6 +6673,20 @@
     </w:p>
     <w:p>
       <w:pPr>
+        <w:jc w:val="both"/>
+        <w:spacing w:line="360" w:lineRule="auto"/>
+        <w:ind w:firstLine="708"/>
+      </w:pPr>
+      <w:r>
+        <w:rPr>
+          <w:rFonts w:ascii="Arial" w:hAnsi="Arial"/>
+          <w:sz w:val="24"/>
+        </w:rPr>
+        <w:t xml:space="preserve">Para alcançar o objetivo geral proposto, foram definidos os seguintes objetivos específicos:</w:t>
+      </w:r>
+    </w:p>
+    <w:p>
+      <w:pPr>
         <w:pStyle w:val="PargrafodaLista"/>
         <w:spacing w:line="360" w:lineRule="auto"/>
         <w:ind w:left="709"/>
@@ -7019,24 +6789,7 @@
           <w:rFonts w:ascii="Arial" w:hAnsi="Arial"/>
           <w:sz w:val="24"/>
         </w:rPr>
-        <w:t>O escopo do trabalho compreendeu os seguintes itens:</w:t>
-      </w:r>
-    </w:p>
-    <w:p>
-      <w:pPr>
-        <w:spacing w:after="0" w:line="360" w:lineRule="auto"/>
-        <w:jc w:val="both"/>
-        <w:rPr>
-          <w:rFonts w:ascii="Arial" w:eastAsia="Arial" w:hAnsi="Arial"/>
-          <w:sz w:val="24"/>
-        </w:rPr>
-      </w:pPr>
-      <w:r>
-        <w:rPr>
-          <w:rFonts w:ascii="Arial" w:eastAsia="Arial" w:hAnsi="Arial"/>
-          <w:sz w:val="24"/>
-        </w:rPr>
-        <w:t>O escopo inclui:</w:t>
+        <w:t>Este projeto delimitou-se ao desenvolvimento de um sistema web para o gerenciamento de espaços de eventos, projetado para atender organizações de diversos portes e segmentos. O escopo do trabalho compreendeu os seguintes itens:</w:t>
       </w:r>
     </w:p>
     <w:p>
@@ -7470,117 +7223,53 @@
     </w:p>
     <w:p>
       <w:pPr>
-        <w:spacing w:after="0" w:line="360" w:lineRule="auto"/>
-        <w:ind w:firstLine="709"/>
-        <w:jc w:val="both"/>
-        <w:rPr>
-          <w:rFonts w:ascii="Arial" w:eastAsia="Arial" w:hAnsi="Arial"/>
-          <w:sz w:val="24"/>
-        </w:rPr>
-      </w:pPr>
-      <w:r>
-        <w:rPr>
-          <w:rFonts w:ascii="Arial" w:hAnsi="Arial"/>
-          <w:sz w:val="24"/>
-        </w:rPr>
-        <w:t>O cronograma do projeto contemplou as atividades previstas para o primeiro semestre de desenvolvimento (TCC 1), organizadas em categorias de planejamento, pesquisa, coleta de dados, definições técnicas e revisão. As Figuras 1 e 2 apresentam o cronograma de atividades do grupo no formato de gráfico de Gantt.</w:t>
-      </w:r>
-    </w:p>
-    <w:p>
-      <w:pPr>
-        <w:spacing w:after="120" w:line="360" w:lineRule="auto"/>
+        <w:jc w:val="both"/>
+        <w:spacing w:line="360" w:lineRule="auto"/>
+        <w:ind w:firstLine="708"/>
+      </w:pPr>
+      <w:r>
+        <w:rPr>
+          <w:rFonts w:ascii="Arial" w:hAnsi="Arial"/>
+          <w:sz w:val="24"/>
+        </w:rPr>
+        <w:t xml:space="preserve">O cronograma do projeto contemplou as atividades previstas para o primeiro semestre de desenvolvimento (TCC 1), organizadas em categorias de planejamento, pesquisa, coleta de dados, definições técnicas e revisão. As Figuras 1 e 2 apresentam o cronograma de atividades do grupo no formato de gráfico de Gantt.</w:t>
+      </w:r>
+    </w:p>
+    <w:p>
+      <w:pPr>
         <w:jc w:val="center"/>
-      </w:pPr>
-      <w:bookmarkStart w:id="25" w:name="_Toc223286286"/>
-      <w:r>
-        <w:rPr>
-          <w:rFonts w:ascii="Arial" w:eastAsia="Arial" w:hAnsi="Arial"/>
-          <w:b/>
+        <w:spacing w:line="360" w:lineRule="auto"/>
+      </w:pPr>
+      <w:r>
+        <w:rPr>
+          <w:rFonts w:ascii="Arial" w:hAnsi="Arial"/>
           <w:sz w:val="20"/>
-          <w:szCs w:val="20"/>
-        </w:rPr>
-        <w:t xml:space="preserve">Figura </w:t>
-      </w:r>
-      <w:r>
-        <w:rPr>
-          <w:rFonts w:ascii="Arial" w:eastAsia="Arial" w:hAnsi="Arial"/>
-          <w:sz w:val="20"/>
-          <w:szCs w:val="20"/>
-        </w:rPr>
-        <w:fldChar w:fldCharType="begin"/>
-      </w:r>
-      <w:r>
-        <w:rPr>
-          <w:rFonts w:ascii="Arial" w:eastAsia="Arial" w:hAnsi="Arial"/>
-          <w:sz w:val="20"/>
-          <w:szCs w:val="20"/>
-        </w:rPr>
-        <w:instrText xml:space="preserve"> SEQ Figura \* ARABIC </w:instrText>
-      </w:r>
-      <w:r>
-        <w:rPr>
-          <w:rFonts w:ascii="Arial" w:eastAsia="Arial" w:hAnsi="Arial"/>
-          <w:sz w:val="20"/>
-          <w:szCs w:val="20"/>
-        </w:rPr>
-        <w:fldChar w:fldCharType="separate"/>
-      </w:r>
-      <w:r>
-        <w:rPr>
-          <w:rFonts w:ascii="Arial" w:eastAsia="Arial" w:hAnsi="Arial"/>
-          <w:noProof/>
-          <w:sz w:val="20"/>
-          <w:szCs w:val="20"/>
-        </w:rPr>
-        <w:t>1</w:t>
-      </w:r>
-      <w:r>
-        <w:rPr>
-          <w:rFonts w:ascii="Arial" w:eastAsia="Arial" w:hAnsi="Arial"/>
-          <w:sz w:val="20"/>
-          <w:szCs w:val="20"/>
-        </w:rPr>
-        <w:fldChar w:fldCharType="end"/>
-      </w:r>
-      <w:r>
-        <w:rPr>
-          <w:rFonts w:ascii="Arial" w:eastAsia="Arial" w:hAnsi="Arial"/>
-          <w:sz w:val="20"/>
-          <w:szCs w:val="20"/>
-        </w:rPr>
-        <w:t xml:space="preserve"> – Gráfico de Gantt do Cronograma do Projeto</w:t>
-      </w:r>
-      <w:bookmarkEnd w:id="25"/>
-    </w:p>
-    <w:p>
-      <w:pPr>
-        <w:spacing w:before="240" w:after="120" w:line="360" w:lineRule="auto"/>
+        </w:rPr>
+        <w:t xml:space="preserve">Figura 1 — Cronograma de atividades do projeto (Parte 1/2)</w:t>
+      </w:r>
+    </w:p>
+    <w:p>
+      <w:pPr>
+        <w:ind w:firstLine="0"/>
         <w:jc w:val="center"/>
       </w:pPr>
       <w:r>
-        <w:rPr>
-          <w:rFonts w:ascii="Arial" w:hAnsi="Arial"/>
-          <w:noProof/>
-          <w:sz w:val="24"/>
-        </w:rPr>
-        <w:lastRenderedPageBreak/>
         <w:drawing>
-          <wp:inline distT="0" distB="0" distL="0" distR="0" wp14:anchorId="39A8F90F" wp14:editId="2267878C">
-            <wp:extent cx="5400000" cy="3360277"/>
-            <wp:effectExtent l="0" t="0" r="0" b="0"/>
+          <wp:inline xmlns:a="http://schemas.openxmlformats.org/drawingml/2006/main" xmlns:pic="http://schemas.openxmlformats.org/drawingml/2006/picture">
+            <wp:extent cx="5400000" cy="4038342"/>
             <wp:docPr id="1" name="Picture 1"/>
             <wp:cNvGraphicFramePr>
-              <a:graphicFrameLocks xmlns:a="http://schemas.openxmlformats.org/drawingml/2006/main" noChangeAspect="1"/>
+              <a:graphicFrameLocks noChangeAspect="1"/>
             </wp:cNvGraphicFramePr>
-            <a:graphic xmlns:a="http://schemas.openxmlformats.org/drawingml/2006/main">
+            <a:graphic>
               <a:graphicData uri="http://schemas.openxmlformats.org/drawingml/2006/picture">
-                <pic:pic xmlns:pic="http://schemas.openxmlformats.org/drawingml/2006/picture">
+                <pic:pic>
                   <pic:nvPicPr>
-                    <pic:cNvPr id="0" name="gantt_cronograma_hires.png"/>
+                    <pic:cNvPr id="0" name="image.png"/>
                     <pic:cNvPicPr/>
                   </pic:nvPicPr>
                   <pic:blipFill>
-                    <a:blip r:embed="rId14"/>
+                    <a:blip r:embed="rId8"/>
                     <a:stretch>
                       <a:fillRect/>
                     </a:stretch>
@@ -7588,11 +7277,9 @@
                   <pic:spPr>
                     <a:xfrm>
                       <a:off x="0" y="0"/>
-                      <a:ext cx="5400000" cy="3360277"/>
+                      <a:ext cx="5400000" cy="4038342"/>
                     </a:xfrm>
-                    <a:prstGeom prst="rect">
-                      <a:avLst/>
-                    </a:prstGeom>
+                    <a:prstGeom prst="rect"/>
                   </pic:spPr>
                 </pic:pic>
               </a:graphicData>
@@ -7603,124 +7290,97 @@
     </w:p>
     <w:p>
       <w:pPr>
-        <w:spacing w:after="0" w:line="360" w:lineRule="auto"/>
         <w:jc w:val="center"/>
-      </w:pPr>
-      <w:r>
-        <w:rPr>
-          <w:rFonts w:ascii="Arial" w:eastAsia="Arial" w:hAnsi="Arial"/>
+        <w:spacing w:line="360" w:lineRule="auto"/>
+      </w:pPr>
+      <w:r>
+        <w:rPr>
+          <w:rFonts w:ascii="Arial" w:hAnsi="Arial"/>
           <w:sz w:val="20"/>
-        </w:rPr>
-        <w:t>Fonte: Elaborado pelos autores (2026).</w:t>
-      </w:r>
-    </w:p>
-    <w:p>
-      <w:pPr>
-        <w:spacing w:after="0" w:line="360" w:lineRule="auto"/>
-        <w:ind w:firstLine="709"/>
-        <w:jc w:val="both"/>
-      </w:pPr>
-      <w:r>
-        <w:rPr>
-          <w:rFonts w:ascii="Arial" w:eastAsia="Arial" w:hAnsi="Arial"/>
-          <w:sz w:val="24"/>
-        </w:rPr>
-        <w:t>O Quadro 1 detalha as principais entregas e seus respectivos prazos para o TCC 1:</w:t>
-      </w:r>
-      <w:r>
-        <w:rPr>
-          <w:rFonts w:ascii="Arial" w:eastAsia="Arial" w:hAnsi="Arial"/>
-          <w:sz w:val="24"/>
-        </w:rPr>
-        <w:t xml:space="preserve">  </w:t>
-      </w:r>
-      <w:r>
-        <w:rPr>
-          <w:rFonts w:ascii="Arial" w:eastAsia="Arial" w:hAnsi="Arial"/>
-          <w:sz w:val="24"/>
-        </w:rPr>
-        <w:t xml:space="preserve">&lt;&lt; fonte dos </w:t>
-      </w:r>
-      <w:r>
-        <w:rPr>
-          <w:rFonts w:ascii="Arial" w:eastAsia="Arial" w:hAnsi="Arial"/>
-          <w:sz w:val="24"/>
-        </w:rPr>
-        <w:t xml:space="preserve">textos de quadros e tabelas é em tamanho de 10pts. Sigam a norma! </w:t>
-      </w:r>
-      <w:r>
-        <w:rPr>
-          <w:rFonts w:ascii="Arial" w:eastAsia="Arial" w:hAnsi="Arial"/>
-          <w:sz w:val="24"/>
-        </w:rPr>
-        <w:t>&gt;&gt;</w:t>
-      </w:r>
-    </w:p>
-    <w:p>
-      <w:pPr>
-        <w:spacing w:after="120" w:line="360" w:lineRule="auto"/>
+          <w:i/>
+        </w:rPr>
+        <w:t xml:space="preserve">Fonte: Elaborado pelos autores (2026).</w:t>
+      </w:r>
+    </w:p>
+    <w:p>
+      <w:pPr>
+        <w:jc w:val="both"/>
+        <w:spacing w:line="360" w:lineRule="auto"/>
+      </w:pPr>
+      <w:r>
+        <w:rPr>
+          <w:rFonts w:ascii="Arial" w:hAnsi="Arial"/>
+          <w:sz w:val="24"/>
+        </w:rPr>
+        <w:t xml:space="preserve"/>
+      </w:r>
+    </w:p>
+    <w:p>
+      <w:pPr>
         <w:jc w:val="center"/>
-      </w:pPr>
-      <w:bookmarkStart w:id="26" w:name="_Toc223286329"/>
-      <w:r>
-        <w:rPr>
-          <w:rFonts w:ascii="Arial" w:eastAsia="Arial" w:hAnsi="Arial"/>
-          <w:b/>
+        <w:spacing w:line="360" w:lineRule="auto"/>
+      </w:pPr>
+      <w:r>
+        <w:rPr>
+          <w:rFonts w:ascii="Arial" w:hAnsi="Arial"/>
           <w:sz w:val="20"/>
-          <w:szCs w:val="20"/>
-        </w:rPr>
-        <w:t xml:space="preserve">Quadro </w:t>
-      </w:r>
-      <w:r>
-        <w:rPr>
-          <w:rFonts w:ascii="Arial" w:eastAsia="Arial" w:hAnsi="Arial"/>
+        </w:rPr>
+        <w:t xml:space="preserve">Figura 2 — Cronograma de atividades do projeto (Parte 2/2)</w:t>
+      </w:r>
+    </w:p>
+    <w:p>
+      <w:pPr>
+        <w:ind w:firstLine="0"/>
+        <w:jc w:val="center"/>
+      </w:pPr>
+      <w:r>
+        <w:drawing>
+          <wp:inline xmlns:a="http://schemas.openxmlformats.org/drawingml/2006/main" xmlns:pic="http://schemas.openxmlformats.org/drawingml/2006/picture">
+            <wp:extent cx="5400000" cy="2958734"/>
+            <wp:docPr id="2" name="Picture 2"/>
+            <wp:cNvGraphicFramePr>
+              <a:graphicFrameLocks noChangeAspect="1"/>
+            </wp:cNvGraphicFramePr>
+            <a:graphic>
+              <a:graphicData uri="http://schemas.openxmlformats.org/drawingml/2006/picture">
+                <pic:pic>
+                  <pic:nvPicPr>
+                    <pic:cNvPr id="0" name="image.png"/>
+                    <pic:cNvPicPr/>
+                  </pic:nvPicPr>
+                  <pic:blipFill>
+                    <a:blip r:embed="rId9"/>
+                    <a:stretch>
+                      <a:fillRect/>
+                    </a:stretch>
+                  </pic:blipFill>
+                  <pic:spPr>
+                    <a:xfrm>
+                      <a:off x="0" y="0"/>
+                      <a:ext cx="5400000" cy="2958734"/>
+                    </a:xfrm>
+                    <a:prstGeom prst="rect"/>
+                  </pic:spPr>
+                </pic:pic>
+              </a:graphicData>
+            </a:graphic>
+          </wp:inline>
+        </w:drawing>
+      </w:r>
+    </w:p>
+    <w:p>
+      <w:pPr>
+        <w:jc w:val="center"/>
+        <w:spacing w:line="360" w:lineRule="auto"/>
+      </w:pPr>
+      <w:r>
+        <w:rPr>
+          <w:rFonts w:ascii="Arial" w:hAnsi="Arial"/>
           <w:sz w:val="20"/>
-          <w:szCs w:val="20"/>
-        </w:rPr>
-        <w:fldChar w:fldCharType="begin"/>
-      </w:r>
-      <w:r>
-        <w:rPr>
-          <w:rFonts w:ascii="Arial" w:eastAsia="Arial" w:hAnsi="Arial"/>
-          <w:sz w:val="20"/>
-          <w:szCs w:val="20"/>
-        </w:rPr>
-        <w:instrText xml:space="preserve"> SEQ Quadro \* ARABIC </w:instrText>
-      </w:r>
-      <w:r>
-        <w:rPr>
-          <w:rFonts w:ascii="Arial" w:eastAsia="Arial" w:hAnsi="Arial"/>
-          <w:sz w:val="20"/>
-          <w:szCs w:val="20"/>
-        </w:rPr>
-        <w:fldChar w:fldCharType="separate"/>
-      </w:r>
-      <w:r>
-        <w:rPr>
-          <w:rFonts w:ascii="Arial" w:eastAsia="Arial" w:hAnsi="Arial"/>
-          <w:noProof/>
-          <w:sz w:val="20"/>
-          <w:szCs w:val="20"/>
-        </w:rPr>
-        <w:t>1</w:t>
-      </w:r>
-      <w:r>
-        <w:rPr>
-          <w:rFonts w:ascii="Arial" w:eastAsia="Arial" w:hAnsi="Arial"/>
-          <w:sz w:val="20"/>
-          <w:szCs w:val="20"/>
-        </w:rPr>
-        <w:fldChar w:fldCharType="end"/>
-      </w:r>
-      <w:r>
-        <w:rPr>
-          <w:rFonts w:ascii="Arial" w:eastAsia="Arial" w:hAnsi="Arial"/>
-          <w:sz w:val="20"/>
-          <w:szCs w:val="20"/>
-        </w:rPr>
-        <w:t xml:space="preserve"> – Cronograma de Entregas do TCC 1</w:t>
-      </w:r>
-      <w:bookmarkEnd w:id="26"/>
+          <w:i/>
+        </w:rPr>
+        <w:t xml:space="preserve">Fonte: Elaborado pelos autores (2026).</w:t>
+      </w:r>
     </w:p>
     <w:tbl>
       <w:tblPr>
@@ -8262,19 +7922,6 @@
     </w:tbl>
     <w:p>
       <w:pPr>
-        <w:spacing w:after="0" w:line="360" w:lineRule="auto"/>
-        <w:jc w:val="center"/>
-      </w:pPr>
-      <w:r>
-        <w:rPr>
-          <w:rFonts w:ascii="Arial" w:eastAsia="Arial" w:hAnsi="Arial"/>
-          <w:sz w:val="20"/>
-        </w:rPr>
-        <w:t>Fonte: Elaborado pelos autores (2026).</w:t>
-      </w:r>
-    </w:p>
-    <w:p>
-      <w:pPr>
         <w:pStyle w:val="Ttulo2"/>
         <w:rPr>
           <w:highlight w:val="green"/>
@@ -8933,10 +8580,10 @@
       </w:pPr>
       <w:r>
         <w:rPr>
-          <w:rFonts w:ascii="Arial" w:eastAsia="Arial" w:hAnsi="Arial"/>
-          <w:sz w:val="24"/>
-        </w:rPr>
-        <w:t>O orçamento do projeto prioriza a utilização de ferramentas e serviços com planos gratuitos, sendo os únicos custos previstos relacionados ao registro de domínio e ao serviço de hospedagem. O custo total estimado para o primeiro ano de operação é de aproximadamente R$ 400,00, considerando o domínio (R$ 40,00/ano) e a hospedagem (R$ 30,00/mês × 12 meses = R$ 360,00/ano).</w:t>
+          <w:rFonts w:ascii="Arial" w:hAnsi="Arial"/>
+          <w:sz w:val="24"/>
+        </w:rPr>
+        <w:t>Os custos de recursos humanos foram estimados com base nos valores médios praticados no mercado da Grande São Paulo. No contexto deste TCC, esses custos foram absorvidos pela equipe acadêmica como parte da formação profissional.</w:t>
       </w:r>
     </w:p>
     <w:p>
@@ -13536,23 +13183,17 @@
       <w:bookmarkStart w:id="96" w:name="_Toc164351199"/>
       <w:bookmarkStart w:id="97" w:name="_Toc164355039"/>
       <w:bookmarkStart w:id="98" w:name="_Toc225672603"/>
-      <w:r>
-        <w:t>APÊNDICE</w:t>
-      </w:r>
       <w:bookmarkEnd w:id="95"/>
       <w:bookmarkEnd w:id="96"/>
-      <w:r>
-        <w:t>S</w:t>
-      </w:r>
-      <w:r>
-        <w:t xml:space="preserve"> </w:t>
-      </w:r>
-      <w:r>
-        <w:rPr/>
-        <w:t>&lt;&lt; Opcional &gt;&gt;</w:t>
-      </w:r>
       <w:bookmarkEnd w:id="97"/>
       <w:bookmarkEnd w:id="98"/>
+      <w:r>
+        <w:rPr>
+          <w:rFonts w:ascii="Arial" w:hAnsi="Arial"/>
+          <w:sz w:val="24"/>
+        </w:rPr>
+        <w:t>APÊNDICES</w:t>
+      </w:r>
     </w:p>
     <w:p>
       <w:pPr>
@@ -13947,23 +13588,17 @@
       <w:bookmarkStart w:id="100" w:name="_Toc164351200"/>
       <w:bookmarkStart w:id="101" w:name="_Toc164355040"/>
       <w:bookmarkStart w:id="102" w:name="_Toc225672604"/>
-      <w:r>
-        <w:t>ANEXO</w:t>
-      </w:r>
       <w:bookmarkEnd w:id="99"/>
       <w:bookmarkEnd w:id="100"/>
-      <w:r>
-        <w:t>S</w:t>
-      </w:r>
-      <w:r>
-        <w:t xml:space="preserve"> </w:t>
-      </w:r>
-      <w:r>
-        <w:rPr/>
-        <w:t>&lt;&lt; Opcional &gt;&gt;</w:t>
-      </w:r>
       <w:bookmarkEnd w:id="101"/>
       <w:bookmarkEnd w:id="102"/>
+      <w:r>
+        <w:rPr>
+          <w:rFonts w:ascii="Arial" w:hAnsi="Arial"/>
+          <w:sz w:val="24"/>
+        </w:rPr>
+        <w:t>ANEXOS</w:t>
+      </w:r>
     </w:p>
     <w:p>
       <w:pPr>
@@ -14356,22 +13991,15 @@
       </w:pPr>
       <w:bookmarkStart w:id="103" w:name="_Toc225672605"/>
       <w:proofErr w:type="gramStart"/>
-      <w:r>
-        <w:t xml:space="preserve">GLOSSÁRIO </w:t>
-      </w:r>
-      <w:r>
-        <w:t xml:space="preserve"> </w:t>
-      </w:r>
-      <w:r>
-        <w:rPr/>
-        <w:t>&lt;</w:t>
-      </w:r>
       <w:proofErr w:type="gramEnd"/>
-      <w:r>
-        <w:rPr/>
-        <w:t>&lt; Opcional &gt;&gt;</w:t>
-      </w:r>
       <w:bookmarkEnd w:id="103"/>
+      <w:r>
+        <w:rPr>
+          <w:rFonts w:ascii="Arial" w:hAnsi="Arial"/>
+          <w:sz w:val="24"/>
+        </w:rPr>
+        <w:t>GLOSSÁRIO</w:t>
+      </w:r>
     </w:p>
     <w:p>
       <w:pPr>

</xml_diff>

<commit_message>
Correção: travessões substituídos por hífens nas legendas
</commit_message>
<xml_diff>
--- a/TCC - AKIRA, HENRIQUE, WESLLEY_Entrega 2.docx
+++ b/TCC - AKIRA, HENRIQUE, WESLLEY_Entrega 2.docx
@@ -724,7 +724,7 @@
           <w:color w:val="000000"/>
           <w:sz w:val="20"/>
         </w:rPr>
-        <w:t>Trabalho de Conclusão de Curso apresentado ao Centro Universitário Senac — Santo Amaro como exigência parcial para obtenção do grau de Bacharel em Sistemas de Informação.</w:t>
+        <w:t>Trabalho de Conclusão de Curso apresentado ao Centro Universitário Senac - Santo Amaro como exigência parcial para obtenção do grau de Bacharel em Sistemas de Informação.</w:t>
       </w:r>
     </w:p>
     <w:p>
@@ -1017,7 +1017,7 @@
           <w:color w:val="000000"/>
           <w:sz w:val="20"/>
         </w:rPr>
-        <w:t>Trabalho de Conclusão de Curso apresentado ao Centro Universitário Senac — Santo Amaro como exigência parcial para obtenção do grau de Bacharel em Sistemas de Informação.</w:t>
+        <w:t>Trabalho de Conclusão de Curso apresentado ao Centro Universitário Senac - Santo Amaro como exigência parcial para obtenção do grau de Bacharel em Sistemas de Informação.</w:t>
       </w:r>
     </w:p>
     <w:p>
@@ -1113,7 +1113,7 @@
           <w:color w:val="000000"/>
           <w:sz w:val="24"/>
         </w:rPr>
-        <w:t>Prof. Jose Martinele Alves Silva — SENAC</w:t>
+        <w:t>Prof. Jose Martinele Alves Silva - SENAC</w:t>
       </w:r>
     </w:p>
     <w:p>
@@ -1164,7 +1164,7 @@
           <w:color w:val="000000"/>
           <w:sz w:val="24"/>
         </w:rPr>
-        <w:t>Prof. ________________________ — SENAC</w:t>
+        <w:t>Prof. ________________________ - SENAC</w:t>
       </w:r>
     </w:p>
     <w:p>
@@ -1215,7 +1215,7 @@
           <w:color w:val="000000"/>
           <w:sz w:val="24"/>
         </w:rPr>
-        <w:t>Prof. ________________________ — ________________________</w:t>
+        <w:t>Prof. ________________________ - ________________________</w:t>
       </w:r>
     </w:p>
     <w:p>
@@ -1312,7 +1312,7 @@
           <w:i w:val="0"/>
           <w:sz w:val="24"/>
         </w:rPr>
-        <w:t>Figura 1 — Cronograma de atividades do projeto (Parte 1/2)</w:t>
+        <w:t>Figura 1 - Cronograma de atividades do projeto (Parte 1/2)</w:t>
       </w:r>
     </w:p>
     <w:p>
@@ -1329,7 +1329,7 @@
           <w:i w:val="0"/>
           <w:sz w:val="24"/>
         </w:rPr>
-        <w:t>Figura 2 — Cronograma de atividades do projeto (Parte 2/2)</w:t>
+        <w:t>Figura 2 - Cronograma de atividades do projeto (Parte 2/2)</w:t>
       </w:r>
     </w:p>
     <w:p>
@@ -1383,7 +1383,7 @@
           <w:color w:val="000000"/>
           <w:sz w:val="24"/>
         </w:rPr>
-        <w:t>Quadro 1 — Cronograma de Entregas do TCC 1</w:t>
+        <w:t>Quadro 1 - Cronograma de Entregas do TCC 1</w:t>
       </w:r>
     </w:p>
     <w:p>
@@ -1400,7 +1400,7 @@
           <w:color w:val="000000"/>
           <w:sz w:val="24"/>
         </w:rPr>
-        <w:t>Quadro 2 — Materiais e Ferramentas Utilizadas</w:t>
+        <w:t>Quadro 2 - Materiais e Ferramentas Utilizadas</w:t>
       </w:r>
     </w:p>
     <w:p>
@@ -1417,7 +1417,7 @@
           <w:color w:val="000000"/>
           <w:sz w:val="24"/>
         </w:rPr>
-        <w:t>Quadro 3 — Orçamento Estimado — Custos de Desenvolvimento</w:t>
+        <w:t>Quadro 3 - Orçamento Estimado - Custos de Desenvolvimento</w:t>
       </w:r>
     </w:p>
     <w:p>
@@ -1434,7 +1434,7 @@
           <w:color w:val="000000"/>
           <w:sz w:val="24"/>
         </w:rPr>
-        <w:t>Quadro 4 — Orçamento Estimado — Custos de Infraestrutura</w:t>
+        <w:t>Quadro 4 - Orçamento Estimado - Custos de Infraestrutura</w:t>
       </w:r>
     </w:p>
     <w:p>
@@ -1451,7 +1451,7 @@
           <w:color w:val="000000"/>
           <w:sz w:val="24"/>
         </w:rPr>
-        <w:t>Quadro 5 — Resumo do Investimento</w:t>
+        <w:t>Quadro 5 - Resumo do Investimento</w:t>
       </w:r>
     </w:p>
     <w:p>
@@ -2354,7 +2354,7 @@
           <w:color w:val="000000"/>
           <w:sz w:val="24"/>
         </w:rPr>
-        <w:t>O ODS 4 — Educação de Qualidade — visa assegurar a educação inclusiva, equitativa e de qualidade, além de promover oportunidades de aprendizagem ao longo da vida para todos (ONU, 2015). O sistema proposto contribui para este objetivo ao otimizar a utilização dos espaços físicos destinados a atividades educacionais e de capacitação profissional, permitindo que mais eventos formativos possam ser realizados com maior eficiência na alocação de recursos.</w:t>
+        <w:t>O ODS 4 - Educação de Qualidade - visa assegurar a educação inclusiva, equitativa e de qualidade, além de promover oportunidades de aprendizagem ao longo da vida para todos (ONU, 2015). O sistema proposto contribui para este objetivo ao otimizar a utilização dos espaços físicos destinados a atividades educacionais e de capacitação profissional, permitindo que mais eventos formativos possam ser realizados com maior eficiência na alocação de recursos.</w:t>
       </w:r>
     </w:p>
     <w:p>
@@ -2371,7 +2371,7 @@
           <w:color w:val="000000"/>
           <w:sz w:val="24"/>
         </w:rPr>
-        <w:t>O ODS 9 — Indústria, Inovação e Infraestrutura — busca construir infraestruturas resilientes, promover a industrialização inclusiva e sustentável e fomentar a inovação (ONU, 2015). O desenvolvimento de uma plataforma digital escalável para a gestão de espaços representa uma inovação nos processos administrativos organizacionais, modernizando a infraestrutura de gestão e estabelecendo um modelo replicável para diferentes contextos.</w:t>
+        <w:t>O ODS 9 - Indústria, Inovação e Infraestrutura - busca construir infraestruturas resilientes, promover a industrialização inclusiva e sustentável e fomentar a inovação (ONU, 2015). O desenvolvimento de uma plataforma digital escalável para a gestão de espaços representa uma inovação nos processos administrativos organizacionais, modernizando a infraestrutura de gestão e estabelecendo um modelo replicável para diferentes contextos.</w:t>
       </w:r>
     </w:p>
     <w:p>
@@ -2388,7 +2388,7 @@
           <w:color w:val="000000"/>
           <w:sz w:val="24"/>
         </w:rPr>
-        <w:t>O ODS 12 — Consumo e Produção Responsáveis — propõe assegurar padrões de produção e de consumo sustentáveis (ONU, 2015). A eliminação de registros em papel e formulários físicos reduz o consumo de recursos materiais, contribuindo para a desmaterialização de processos. Além disso, a otimização da taxa de ocupação dos espaços promove o uso mais racional da infraestrutura existente, evitando ociosidade e desperdício de recursos como energia e manutenção.</w:t>
+        <w:t>O ODS 12 - Consumo e Produção Responsáveis - propõe assegurar padrões de produção e de consumo sustentáveis (ONU, 2015). A eliminação de registros em papel e formulários físicos reduz o consumo de recursos materiais, contribuindo para a desmaterialização de processos. Além disso, a otimização da taxa de ocupação dos espaços promove o uso mais racional da infraestrutura existente, evitando ociosidade e desperdício de recursos como energia e manutenção.</w:t>
       </w:r>
     </w:p>
     <w:p>
@@ -2893,7 +2893,7 @@
           <w:color w:val="000000"/>
           <w:sz w:val="20"/>
         </w:rPr>
-        <w:t>Quadro 2 — Materiais e Ferramentas Utilizadas</w:t>
+        <w:t>Quadro 2 - Materiais e Ferramentas Utilizadas</w:t>
       </w:r>
     </w:p>
     <w:tbl>
@@ -3738,7 +3738,7 @@
           <w:color w:val="000000"/>
           <w:sz w:val="24"/>
         </w:rPr>
-        <w:t>• Capítulo 1 — Introdução: apresenta a contextualização do problema, os objetivos do projeto, a delimitação do escopo, a relevância da pesquisa, a metodologia adotada, o cronograma de atividades e o orçamento;</w:t>
+        <w:t>• Capítulo 1 - Introdução: apresenta a contextualização do problema, os objetivos do projeto, a delimitação do escopo, a relevância da pesquisa, a metodologia adotada, o cronograma de atividades e o orçamento;</w:t>
       </w:r>
     </w:p>
     <w:p>
@@ -3755,7 +3755,7 @@
           <w:color w:val="000000"/>
           <w:sz w:val="24"/>
         </w:rPr>
-        <w:t>• Capítulo 2 — Referencial Teórico: aborda os conceitos fundamentais, as tecnologias e as metodologias que embasam o desenvolvimento do sistema;</w:t>
+        <w:t>• Capítulo 2 - Referencial Teórico: aborda os conceitos fundamentais, as tecnologias e as metodologias que embasam o desenvolvimento do sistema;</w:t>
       </w:r>
     </w:p>
     <w:p>
@@ -3772,7 +3772,7 @@
           <w:color w:val="000000"/>
           <w:sz w:val="24"/>
         </w:rPr>
-        <w:t>• Capítulo 3 — Proposta da Aplicação: detalha a descrição do sistema, os requisitos, a modelagem, a arquitetura, os protótipos e a modelagem do banco de dados;</w:t>
+        <w:t>• Capítulo 3 - Proposta da Aplicação: detalha a descrição do sistema, os requisitos, a modelagem, a arquitetura, os protótipos e a modelagem do banco de dados;</w:t>
       </w:r>
     </w:p>
     <w:p>
@@ -3789,7 +3789,7 @@
           <w:color w:val="000000"/>
           <w:sz w:val="24"/>
         </w:rPr>
-        <w:t>• Capítulo 4 — Exemplo da Aplicação: demonstra o funcionamento prático do sistema por meio de cenários de uso;</w:t>
+        <w:t>• Capítulo 4 - Exemplo da Aplicação: demonstra o funcionamento prático do sistema por meio de cenários de uso;</w:t>
       </w:r>
     </w:p>
     <w:p>
@@ -3806,7 +3806,7 @@
           <w:color w:val="000000"/>
           <w:sz w:val="24"/>
         </w:rPr>
-        <w:t>• Capítulo 5 — Considerações Finais: apresenta as conclusões do trabalho, as limitações encontradas e as sugestões para trabalhos futuros.</w:t>
+        <w:t>• Capítulo 5 - Considerações Finais: apresenta as conclusões do trabalho, as limitações encontradas e as sugestões para trabalhos futuros.</w:t>
       </w:r>
     </w:p>
     <w:p>
@@ -3858,7 +3858,7 @@
           <w:i w:val="0"/>
           <w:sz w:val="20"/>
         </w:rPr>
-        <w:t>Figura 1 — Cronograma de atividades do projeto (Parte 1/2)</w:t>
+        <w:t>Figura 1 - Cronograma de atividades do projeto (Parte 1/2)</w:t>
       </w:r>
     </w:p>
     <w:p>
@@ -3932,7 +3932,7 @@
           <w:i w:val="0"/>
           <w:sz w:val="20"/>
         </w:rPr>
-        <w:t>Figura 2 — Cronograma de atividades do projeto (Parte 2/2)</w:t>
+        <w:t>Figura 2 - Cronograma de atividades do projeto (Parte 2/2)</w:t>
       </w:r>
     </w:p>
     <w:p>
@@ -4024,7 +4024,7 @@
           <w:color w:val="000000"/>
           <w:sz w:val="20"/>
         </w:rPr>
-        <w:t>Quadro 1 — Cronograma de Entregas do TCC 1</w:t>
+        <w:t>Quadro 1 - Cronograma de Entregas do TCC 1</w:t>
       </w:r>
     </w:p>
     <w:tbl>
@@ -4169,7 +4169,7 @@
                 <w:color w:val="000000"/>
                 <w:sz w:val="20"/>
               </w:rPr>
-              <w:t>Capítulo 1 — Introdução (Pré-projeto)</w:t>
+              <w:t>Capítulo 1 - Introdução (Pré-projeto)</w:t>
             </w:r>
           </w:p>
         </w:tc>
@@ -4237,7 +4237,7 @@
                 <w:color w:val="000000"/>
                 <w:sz w:val="20"/>
               </w:rPr>
-              <w:t>Capítulo 2 — Referencial Teórico</w:t>
+              <w:t>Capítulo 2 - Referencial Teórico</w:t>
             </w:r>
           </w:p>
         </w:tc>
@@ -4305,7 +4305,7 @@
                 <w:color w:val="000000"/>
                 <w:sz w:val="20"/>
               </w:rPr>
-              <w:t>Capítulo 3 — Modelagens e Prototipação</w:t>
+              <w:t>Capítulo 3 - Modelagens e Prototipação</w:t>
             </w:r>
           </w:p>
         </w:tc>
@@ -4581,7 +4581,7 @@
           <w:color w:val="000000"/>
           <w:sz w:val="20"/>
         </w:rPr>
-        <w:t>Quadro 3 — Orçamento Estimado — Custos de Desenvolvimento (Recursos Humanos)</w:t>
+        <w:t>Quadro 3 - Orçamento Estimado - Custos de Desenvolvimento (Recursos Humanos)</w:t>
       </w:r>
     </w:p>
     <w:tbl>
@@ -5167,7 +5167,7 @@
           <w:color w:val="000000"/>
           <w:sz w:val="20"/>
         </w:rPr>
-        <w:t>Quadro 4 — Orçamento Estimado — Custos de Infraestrutura (Anual)</w:t>
+        <w:t>Quadro 4 - Orçamento Estimado - Custos de Infraestrutura (Anual)</w:t>
       </w:r>
     </w:p>
     <w:tbl>
@@ -5335,7 +5335,7 @@
                 <w:color w:val="000000"/>
                 <w:sz w:val="20"/>
               </w:rPr>
-              <w:t>—</w:t>
+              <w:t>-</w:t>
             </w:r>
           </w:p>
         </w:tc>
@@ -5932,7 +5932,7 @@
           <w:color w:val="000000"/>
           <w:sz w:val="20"/>
         </w:rPr>
-        <w:t>Quadro 5 — Resumo do Investimento</w:t>
+        <w:t>Quadro 5 - Resumo do Investimento</w:t>
       </w:r>
     </w:p>
     <w:tbl>
@@ -6292,7 +6292,7 @@
           <w:i w:val="0"/>
           <w:sz w:val="24"/>
         </w:rPr>
-        <w:t>A gestão de espaços físicos em organizações — salas de reunião, auditórios, laboratórios, espaços de eventos e áreas compartilhadas — constitui uma atividade operacional que, embora aparentemente simples, carrega consigo uma complexidade administrativa historicamente subestimada. Desde as primeiras formulações da teoria clássica da administração, no início do século XX, a alocação de recursos físicos já figurava como elemento central da função organizacional. Chiavenato (2021, p. 74) observou que a preocupação com a racionalização do uso de espaços e recursos materiais remonta aos princípios de Henri Fayol, para quem a organização eficiente dependia fundamentalmente da disposição ordenada dos meios disponíveis. Contudo, apesar de mais de um século de evolução nas teorias administrativas, um número expressivo de organizações ainda conduz a gestão de seus espaços por meio de processos predominantemente manuais — planilhas eletrônicas, cadernos de reserva, quadros murais e comunicações informais por telefone ou e-mail.</w:t>
+        <w:t>A gestão de espaços físicos em organizações - salas de reunião, auditórios, laboratórios, espaços de eventos e áreas compartilhadas - constitui uma atividade operacional que, embora aparentemente simples, carrega consigo uma complexidade administrativa historicamente subestimada. Desde as primeiras formulações da teoria clássica da administração, no início do século XX, a alocação de recursos físicos já figurava como elemento central da função organizacional. Chiavenato (2021, p. 74) observou que a preocupação com a racionalização do uso de espaços e recursos materiais remonta aos princípios de Henri Fayol, para quem a organização eficiente dependia fundamentalmente da disposição ordenada dos meios disponíveis. Contudo, apesar de mais de um século de evolução nas teorias administrativas, um número expressivo de organizações ainda conduz a gestão de seus espaços por meio de processos predominantemente manuais - planilhas eletrônicas, cadernos de reserva, quadros murais e comunicações informais por telefone ou e-mail.</w:t>
       </w:r>
     </w:p>
     <w:p>
@@ -6308,7 +6308,7 @@
           <w:i w:val="0"/>
           <w:sz w:val="24"/>
         </w:rPr>
-        <w:t>O problema da gestão manual de espaços não é, portanto, um fenômeno recente, mas um resíduo persistente de práticas pré-digitais que não acompanharam a velocidade da transformação tecnológica. Laudon e Laudon (2021, p. 42) argumentaram que a digitalização dos processos organizacionais avançou de forma desigual entre os diferentes setores e portes de empresa, de modo que atividades consideradas "secundárias" — como o agendamento de salas — frequentemente permanecem à margem dos investimentos em tecnologia da informação. Essa marginalização resulta em um cenário no qual organizações que já adotaram sistemas sofisticados para finanças, recursos humanos e logística continuam dependendo de métodos rudimentares para gerenciar seus próprios espaços físicos.</w:t>
+        <w:t>O problema da gestão manual de espaços não é, portanto, um fenômeno recente, mas um resíduo persistente de práticas pré-digitais que não acompanharam a velocidade da transformação tecnológica. Laudon e Laudon (2021, p. 42) argumentaram que a digitalização dos processos organizacionais avançou de forma desigual entre os diferentes setores e portes de empresa, de modo que atividades consideradas "secundárias" - como o agendamento de salas - frequentemente permanecem à margem dos investimentos em tecnologia da informação. Essa marginalização resulta em um cenário no qual organizações que já adotaram sistemas sofisticados para finanças, recursos humanos e logística continuam dependendo de métodos rudimentares para gerenciar seus próprios espaços físicos.</w:t>
       </w:r>
     </w:p>
     <w:p>
@@ -6323,7 +6323,7 @@
           <w:sz w:val="24"/>
           <w:szCs w:val="24"/>
         </w:rPr>
-        <w:t xml:space="preserve">As consequências dessa lacuna tecnológica são amplamente documentadas na literatura. Slack, Brandon-Jones e Johnston (2022, p. 298) destacaram que a gestão ineficiente de recursos compartilhados gera conflitos de agendamento — situação em que dois ou mais eventos são alocados para o mesmo espaço no mesmo horário —, subutilização de ambientes disponíveis e desperdício de tempo administrativo para resolução de sobreposições. O fenômeno do </w:t>
+        <w:t xml:space="preserve">As consequências dessa lacuna tecnológica são amplamente documentadas na literatura. Slack, Brandon-Jones e Johnston (2022, p. 298) destacaram que a gestão ineficiente de recursos compartilhados gera conflitos de agendamento - situação em que dois ou mais eventos são alocados para o mesmo espaço no mesmo horário -, subutilização de ambientes disponíveis e desperdício de tempo administrativo para resolução de sobreposições. O fenômeno do </w:t>
       </w:r>
       <w:r>
         <w:rPr>
@@ -6340,7 +6340,7 @@
           <w:sz w:val="24"/>
           <w:szCs w:val="24"/>
         </w:rPr>
-        <w:t xml:space="preserve">, como é conhecido na literatura anglófona, representa não apenas um inconveniente operacional, mas uma fonte de atrito organizacional que compromete a credibilidade dos setores responsáveis e a confiança dos usuários internos no processo de reserva. Stair e Reynolds (2021, p. 56) acrescentaram que processos manuais de agendamento estão intrinsecamente sujeitos a erros humanos — omissões, registros ilegíveis, esquecimentos de cancelamento e falhas de comunicação entre departamentos — que se acumulam ao longo do tempo e degradam progressivamente a qualidade da gestão.</w:t>
+        <w:t>, como é conhecido na literatura anglófona, representa não apenas um inconveniente operacional, mas uma fonte de atrito organizacional que compromete a credibilidade dos setores responsáveis e a confiança dos usuários internos no processo de reserva. Stair e Reynolds (2021, p. 56) acrescentaram que processos manuais de agendamento estão intrinsecamente sujeitos a erros humanos - omissões, registros ilegíveis, esquecimentos de cancelamento e falhas de comunicação entre departamentos - que se acumulam ao longo do tempo e degradam progressivamente a qualidade da gestão.</w:t>
       </w:r>
     </w:p>
     <w:p>
@@ -6356,7 +6356,7 @@
           <w:i w:val="0"/>
           <w:sz w:val="24"/>
         </w:rPr>
-        <w:t>Do ponto de vista da produtividade, os impactos são igualmente significativos. Turban, Volonino e Wood (2022, p. 113) estimaram que atividades administrativas conduzidas manualmente consomem, em média, de 20% a 30% mais tempo do que seus equivalentes automatizados, considerando não apenas a execução da tarefa em si, mas também o retrabalho decorrente de erros e a necessidade de verificações redundantes. No contexto específico da gestão de espaços, esse custo adicional de tempo se traduz em horas dedicadas à conferência de disponibilidade, ao contato com outros setores para confirmação de reservas e à resolução de conflitos que poderiam ser automaticamente prevenidos por um sistema informatizado. O'Brien e Marakas (2021, p. 87) reforçaram essa perspectiva ao afirmar que a ausência de sistemas de informação para apoio às decisões operacionais priva os gestores de dados consolidados sobre padrões de uso, taxas de ocupação e demandas sazonais — informações que seriam essenciais para o planejamento estratégico do uso dos espaços disponíveis.</w:t>
+        <w:t>Do ponto de vista da produtividade, os impactos são igualmente significativos. Turban, Volonino e Wood (2022, p. 113) estimaram que atividades administrativas conduzidas manualmente consomem, em média, de 20% a 30% mais tempo do que seus equivalentes automatizados, considerando não apenas a execução da tarefa em si, mas também o retrabalho decorrente de erros e a necessidade de verificações redundantes. No contexto específico da gestão de espaços, esse custo adicional de tempo se traduz em horas dedicadas à conferência de disponibilidade, ao contato com outros setores para confirmação de reservas e à resolução de conflitos que poderiam ser automaticamente prevenidos por um sistema informatizado. O'Brien e Marakas (2021, p. 87) reforçaram essa perspectiva ao afirmar que a ausência de sistemas de informação para apoio às decisões operacionais priva os gestores de dados consolidados sobre padrões de uso, taxas de ocupação e demandas sazonais - informações que seriam essenciais para o planejamento estratégico do uso dos espaços disponíveis.</w:t>
       </w:r>
     </w:p>
     <w:p>
@@ -6420,7 +6420,7 @@
           <w:i w:val="0"/>
           <w:sz w:val="24"/>
         </w:rPr>
-        <w:t>Não obstante essas ressalvas, a tendência predominante na literatura aponta para a insustentabilidade dos processos manuais à medida que as organizações crescem, diversificam suas atividades ou enfrentam demandas por maior transparência e eficiência. Turban, Volonino e Wood (2022, p. 189) argumentaram que o ponto de inflexão ocorre quando o custo do erro — em termos de tempo perdido, imagem institucional comprometida e oportunidades desperdiçadas — supera o custo da implantação de uma solução tecnológica. Stair e Reynolds (2021, p. 112) complementaram que a transformação digital não se limita à automação de tarefas existentes, mas envolve uma reconfiguração dos fluxos de trabalho que permite a criação de valor por meio de dados antes indisponíveis.</w:t>
+        <w:t>Não obstante essas ressalvas, a tendência predominante na literatura aponta para a insustentabilidade dos processos manuais à medida que as organizações crescem, diversificam suas atividades ou enfrentam demandas por maior transparência e eficiência. Turban, Volonino e Wood (2022, p. 189) argumentaram que o ponto de inflexão ocorre quando o custo do erro - em termos de tempo perdido, imagem institucional comprometida e oportunidades desperdiçadas - supera o custo da implantação de uma solução tecnológica. Stair e Reynolds (2021, p. 112) complementaram que a transformação digital não se limita à automação de tarefas existentes, mas envolve uma reconfiguração dos fluxos de trabalho que permite a criação de valor por meio de dados antes indisponíveis.</w:t>
       </w:r>
     </w:p>
     <w:p>
@@ -6532,7 +6532,7 @@
           <w:i w:val="0"/>
           <w:sz w:val="24"/>
         </w:rPr>
-        <w:t>As instituições de ensino — escolas, universidades e centros de formação profissional — enfrentam desafios particularmente agudos na gestão de espaços, dada a multiplicidade de atores envolvidos e a natureza cíclica e dinâmica de suas demandas. Salas de aula, laboratórios, auditórios e espaços de convivência precisam ser alocados semestralmente para disciplinas regulares e, simultaneamente, disponibilizados para eventos acadêmicos, atividades de extensão, defesas de trabalhos e reuniões administrativas. O IBGE (2023) constatou que a infraestrutura tecnológica de instituições públicas de ensino permanece significativamente aquém da verificada em instituições privadas de grande porte, o que contribui para a perpetuação de métodos manuais de gestão de espaços nesse segmento.</w:t>
+        <w:t>As instituições de ensino - escolas, universidades e centros de formação profissional - enfrentam desafios particularmente agudos na gestão de espaços, dada a multiplicidade de atores envolvidos e a natureza cíclica e dinâmica de suas demandas. Salas de aula, laboratórios, auditórios e espaços de convivência precisam ser alocados semestralmente para disciplinas regulares e, simultaneamente, disponibilizados para eventos acadêmicos, atividades de extensão, defesas de trabalhos e reuniões administrativas. O IBGE (2023) constatou que a infraestrutura tecnológica de instituições públicas de ensino permanece significativamente aquém da verificada em instituições privadas de grande porte, o que contribui para a perpetuação de métodos manuais de gestão de espaços nesse segmento.</w:t>
       </w:r>
     </w:p>
     <w:p>
@@ -6581,7 +6581,7 @@
           <w:sz w:val="24"/>
           <w:szCs w:val="24"/>
         </w:rPr>
-        <w:t xml:space="preserve"> depende de um equilíbrio entre maximização da ocupação e qualidade da experiência do usuário — equilíbrio que é praticamente inviável sem o suporte de ferramentas tecnológicas para gestão em tempo real.</w:t>
+        <w:t xml:space="preserve"> depende de um equilíbrio entre maximização da ocupação e qualidade da experiência do usuário - equilíbrio que é praticamente inviável sem o suporte de ferramentas tecnológicas para gestão em tempo real.</w:t>
       </w:r>
     </w:p>
     <w:p>
@@ -6726,7 +6726,7 @@
           <w:i w:val="0"/>
           <w:sz w:val="24"/>
         </w:rPr>
-        <w:t xml:space="preserve">O ODS 4, "Educação de Qualidade", busca assegurar a educação inclusiva e equitativa de qualidade e promover oportunidades de aprendizagem ao longo da vida para todos. A gestão eficiente de espaços para eventos em instituições de ensino possibilita a realização de um maior número de atividades acadêmicas — palestras, seminários, </w:t>
+        <w:t xml:space="preserve">O ODS 4, "Educação de Qualidade", busca assegurar a educação inclusiva e equitativa de qualidade e promover oportunidades de aprendizagem ao longo da vida para todos. A gestão eficiente de espaços para eventos em instituições de ensino possibilita a realização de um maior número de atividades acadêmicas - palestras, seminários, </w:t>
       </w:r>
       <w:r>
         <w:rPr>
@@ -6744,7 +6744,7 @@
           <w:i w:val="0"/>
           <w:sz w:val="24"/>
         </w:rPr>
-        <w:t xml:space="preserve"> e congressos —, ampliando as oportunidades de aprendizagem para a comunidade acadêmica. O relatório de desenvolvimento humano do UNDP (UNITED NATIONS DEVELOPMENT PROGRAMME, 2024, p. 112) ressalta que a infraestrutura de apoio — incluindo a disponibilidade e a gestão adequada de espaços físicos — é um fator frequentemente subestimado na avaliação da qualidade educacional. Ao eliminar barreiras operacionais, o sistema contribui indiretamente para a meta 4.a, que trata da melhoria de instalações educacionais.</w:t>
+        <w:t xml:space="preserve"> e congressos -, ampliando as oportunidades de aprendizagem para a comunidade acadêmica. O relatório de desenvolvimento humano do UNDP (UNITED NATIONS DEVELOPMENT PROGRAMME, 2024, p. 112) ressalta que a infraestrutura de apoio - incluindo a disponibilidade e a gestão adequada de espaços físicos - é um fator frequentemente subestimado na avaliação da qualidade educacional. Ao eliminar barreiras operacionais, o sistema contribui indiretamente para a meta 4.a, que trata da melhoria de instalações educacionais.</w:t>
       </w:r>
     </w:p>
     <w:p>
@@ -6972,7 +6972,7 @@
           <w:i w:val="0"/>
           <w:sz w:val="24"/>
         </w:rPr>
-        <w:t>Entretanto, uma análise mais detida revela limitações relevantes dessas soluções no contexto brasileiro. Os custos de licenciamento — frequentemente cobrados em moeda estrangeira — podem ser proibitivos para organizações com orçamento limitado. A maioria dessas plataformas oferece possibilidades restritas de personalização. Ademais, a dependência de plataformas estrangeiras suscita preocupações quanto à conformidade com a Lei Geral de Proteção de Dados Pessoais (BRASIL, 2018), uma vez que o armazenamento de dados pessoais em servidores fora do território nacional impõe desafios adicionais de governança.</w:t>
+        <w:t>Entretanto, uma análise mais detida revela limitações relevantes dessas soluções no contexto brasileiro. Os custos de licenciamento - frequentemente cobrados em moeda estrangeira - podem ser proibitivos para organizações com orçamento limitado. A maioria dessas plataformas oferece possibilidades restritas de personalização. Ademais, a dependência de plataformas estrangeiras suscita preocupações quanto à conformidade com a Lei Geral de Proteção de Dados Pessoais (BRASIL, 2018), uma vez que o armazenamento de dados pessoais em servidores fora do território nacional impõe desafios adicionais de governança.</w:t>
       </w:r>
     </w:p>
     <w:p>
@@ -7352,7 +7352,7 @@
           <w:sz w:val="24"/>
           <w:szCs w:val="24"/>
         </w:rPr>
-        <w:t xml:space="preserve"> oferece conformidade com as propriedades ACID — atomicidade, consistência, isolamento e durabilidade —, o que garante a integridade transacional indispensável em um sistema de agendamento. O suporte nativo a tipos de dados JSON possibilita o armazenamento flexível de metadados associados aos espaços e eventos. A integração entre a aplicação e o banco de dados é mediada pelo </w:t>
+        <w:t xml:space="preserve"> oferece conformidade com as propriedades ACID - atomicidade, consistência, isolamento e durabilidade -, o que garante a integridade transacional indispensável em um sistema de agendamento. O suporte nativo a tipos de dados JSON possibilita o armazenamento flexível de metadados associados aos espaços e eventos. A integração entre a aplicação e o banco de dados é mediada pelo </w:t>
       </w:r>
       <w:r>
         <w:rPr>
@@ -7452,7 +7452,7 @@
           <w:sz w:val="24"/>
           <w:szCs w:val="24"/>
         </w:rPr>
-        <w:t xml:space="preserve"> Docs (MOZILLA DEVELOPER NETWORK, 2024) reconhece que essa abordagem promove maior consistência visual e facilita a criação de interfaces responsivas — requisito relevante para um sistema acessado tanto em desktops quanto em dispositivos móveis.</w:t>
+        <w:t xml:space="preserve"> Docs (MOZILLA DEVELOPER NETWORK, 2024) reconhece que essa abordagem promove maior consistência visual e facilita a criação de interfaces responsivas - requisito relevante para um sistema acessado tanto em desktops quanto em dispositivos móveis.</w:t>
       </w:r>
     </w:p>
     <w:p>
@@ -7533,7 +7533,7 @@
           <w:sz w:val="24"/>
           <w:szCs w:val="24"/>
         </w:rPr>
-        <w:t xml:space="preserve">Em síntese, a pilha tecnológica selecionada — </w:t>
+        <w:t xml:space="preserve">Em síntese, a pilha tecnológica selecionada - </w:t>
       </w:r>
       <w:r>
         <w:rPr>
@@ -7635,7 +7635,7 @@
           <w:sz w:val="24"/>
           <w:szCs w:val="24"/>
         </w:rPr>
-        <w:t xml:space="preserve"> — representa uma combinação coerente de ferramentas modernas, maduras e de código aberto, que oferece o equilíbrio necessário entre produtividade de desenvolvimento, robustez técnica e adequação ao contexto acadêmico do presente trabalho.</w:t>
+        <w:t xml:space="preserve"> - representa uma combinação coerente de ferramentas modernas, maduras e de código aberto, que oferece o equilíbrio necessário entre produtividade de desenvolvimento, robustez técnica e adequação ao contexto acadêmico do presente trabalho.</w:t>
       </w:r>
     </w:p>
     <w:p>
@@ -8354,7 +8354,7 @@
           <w:szCs w:val="24"/>
           <w:b/>
         </w:rPr>
-        <w:t xml:space="preserve">Pesquisa salarial: desenvolvedor full-stack — São Paulo</w:t>
+        <w:t>Pesquisa salarial: desenvolvedor full-stack - São Paulo</w:t>
       </w:r>
       <w:r>
         <w:rPr>
@@ -9064,7 +9064,7 @@
           <w:szCs w:val="24"/>
           <w:b/>
         </w:rPr>
-        <w:t xml:space="preserve">Pesquisa Nacional por Amostra de Domicílios Contínua — PNAD Contínua</w:t>
+        <w:t>Pesquisa Nacional por Amostra de Domicílios Contínua - PNAD Contínua</w:t>
       </w:r>
       <w:r>
         <w:rPr>
@@ -9096,7 +9096,7 @@
           <w:szCs w:val="24"/>
           <w:b/>
         </w:rPr>
-        <w:t xml:space="preserve">ODS — Metas Nacionais dos Objetivos de Desenvolvimento Sustentável</w:t>
+        <w:t>ODS - Metas Nacionais dos Objetivos de Desenvolvimento Sustentável</w:t>
       </w:r>
       <w:r>
         <w:rPr>

</xml_diff>